<commit_message>
Add Huber deviation and MAD filter utilities
</commit_message>
<xml_diff>
--- a/examples/general/doc/05-utilities-examples_deviation_measures.docx
+++ b/examples/general/doc/05-utilities-examples_deviation_measures.docx
@@ -16,7 +16,7 @@
         <w:pStyle w:val="FirstParagraph"/>
       </w:pPr>
       <w:r>
-        <w:t xml:space="preserve">The goal of this notebook is to present a complete Harbinger workflow: loading an example dataset, configuring the method used in the notebook, running the analysis, and interpreting the resulting outputs and plots.</w:t>
+        <w:t xml:space="preserve">The goal of this notebook is to compare Harbinger deviation measures in isolation, so the reader can understand how different residual summaries reshape the score before any filter criterion is applied.</w:t>
       </w:r>
     </w:p>
     <w:bookmarkEnd w:id="9"/>
@@ -34,17 +34,40 @@
         <w:pStyle w:val="FirstParagraph"/>
       </w:pPr>
       <w:r>
-        <w:t xml:space="preserve">This notebook demonstrates Harbinger utility deviation measures for summarizing residual magnitudes (L1 and L2) and plotting results for quick inspection. L1 emphasizes robustness to outliers; L2 emphasizes larger deviations. These aggregations feed subsequent filter criteria in the detection pipeline.</w:t>
-      </w:r>
-    </w:p>
-    <w:bookmarkEnd w:id="10"/>
-    <w:bookmarkStart w:id="19" w:name="what-you-will-do"/>
-    <w:p>
-      <w:pPr>
-        <w:pStyle w:val="Heading2"/>
-      </w:pPr>
-      <w:r>
-        <w:t xml:space="preserve">What you will do</w:t>
+        <w:t xml:space="preserve">This notebook demonstrates Harbinger utility deviation measures for summarizing residual magnitudes (</w:t>
+      </w:r>
+      <w:r>
+        <w:rPr>
+          <w:rStyle w:val="VerbatimChar"/>
+        </w:rPr>
+        <w:t xml:space="preserve">L1</w:t>
+      </w:r>
+      <w:r>
+        <w:t xml:space="preserve">,</w:t>
+      </w:r>
+      <w:r>
+        <w:t xml:space="preserve"> </w:t>
+      </w:r>
+      <w:r>
+        <w:rPr>
+          <w:rStyle w:val="VerbatimChar"/>
+        </w:rPr>
+        <w:t xml:space="preserve">L2</w:t>
+      </w:r>
+      <w:r>
+        <w:t xml:space="preserve">, and</w:t>
+      </w:r>
+      <w:r>
+        <w:t xml:space="preserve"> </w:t>
+      </w:r>
+      <w:r>
+        <w:rPr>
+          <w:rStyle w:val="VerbatimChar"/>
+        </w:rPr>
+        <w:t xml:space="preserve">Huber</w:t>
+      </w:r>
+      <w:r>
+        <w:t xml:space="preserve">) and plotting results for quick inspection.</w:t>
       </w:r>
     </w:p>
     <w:p>
@@ -56,7 +79,16 @@
         </w:numPr>
       </w:pPr>
       <w:r>
-        <w:t xml:space="preserve">understand the purpose of the example and when the technique is useful</w:t>
+        <w:rPr>
+          <w:rStyle w:val="VerbatimChar"/>
+        </w:rPr>
+        <w:t xml:space="preserve">L1</w:t>
+      </w:r>
+      <w:r>
+        <w:t xml:space="preserve"> </w:t>
+      </w:r>
+      <w:r>
+        <w:t xml:space="preserve">emphasizes robustness to outliers.</w:t>
       </w:r>
     </w:p>
     <w:p>
@@ -68,7 +100,16 @@
         </w:numPr>
       </w:pPr>
       <w:r>
-        <w:t xml:space="preserve">follow the workflow from data loading to model fitting and detection</w:t>
+        <w:rPr>
+          <w:rStyle w:val="VerbatimChar"/>
+        </w:rPr>
+        <w:t xml:space="preserve">L2</w:t>
+      </w:r>
+      <w:r>
+        <w:t xml:space="preserve"> </w:t>
+      </w:r>
+      <w:r>
+        <w:t xml:space="preserve">emphasizes larger deviations more strongly.</w:t>
       </w:r>
     </w:p>
     <w:p>
@@ -80,7 +121,70 @@
         </w:numPr>
       </w:pPr>
       <w:r>
-        <w:t xml:space="preserve">inspect the evaluation outputs and the diagnostic plots produced by Harbinger</w:t>
+        <w:rPr>
+          <w:rStyle w:val="VerbatimChar"/>
+        </w:rPr>
+        <w:t xml:space="preserve">Huber</w:t>
+      </w:r>
+      <w:r>
+        <w:t xml:space="preserve"> </w:t>
+      </w:r>
+      <w:r>
+        <w:t xml:space="preserve">interpolates between the two: quadratic near zero and linear in the tails.</w:t>
+      </w:r>
+    </w:p>
+    <w:p>
+      <w:pPr>
+        <w:pStyle w:val="FirstParagraph"/>
+      </w:pPr>
+      <w:r>
+        <w:t xml:space="preserve">These aggregations feed subsequent filter criteria in the detection pipeline.</w:t>
+      </w:r>
+    </w:p>
+    <w:bookmarkEnd w:id="10"/>
+    <w:bookmarkStart w:id="22" w:name="what-you-will-do"/>
+    <w:p>
+      <w:pPr>
+        <w:pStyle w:val="Heading2"/>
+      </w:pPr>
+      <w:r>
+        <w:t xml:space="preserve">What you will do</w:t>
+      </w:r>
+    </w:p>
+    <w:p>
+      <w:pPr>
+        <w:pStyle w:val="Compact"/>
+        <w:numPr>
+          <w:ilvl w:val="0"/>
+          <w:numId w:val="1002"/>
+        </w:numPr>
+      </w:pPr>
+      <w:r>
+        <w:t xml:space="preserve">compare how different deviation measures rescale the same residual series</w:t>
+      </w:r>
+    </w:p>
+    <w:p>
+      <w:pPr>
+        <w:pStyle w:val="Compact"/>
+        <w:numPr>
+          <w:ilvl w:val="0"/>
+          <w:numId w:val="1002"/>
+        </w:numPr>
+      </w:pPr>
+      <w:r>
+        <w:t xml:space="preserve">understand what each deviation measure privileges in practice</w:t>
+      </w:r>
+    </w:p>
+    <w:p>
+      <w:pPr>
+        <w:pStyle w:val="Compact"/>
+        <w:numPr>
+          <w:ilvl w:val="0"/>
+          <w:numId w:val="1002"/>
+        </w:numPr>
+      </w:pPr>
+      <w:r>
+        <w:t xml:space="preserve">connect those score shapes to later thresholding decisions</w:t>
       </w:r>
     </w:p>
     <w:bookmarkStart w:id="11" w:name="prepare-the-example"/>
@@ -97,7 +201,7 @@
         <w:pStyle w:val="FirstParagraph"/>
       </w:pPr>
       <w:r>
-        <w:t xml:space="preserve">This setup anchors the notebook in the specific series used to examine</w:t>
+        <w:t xml:space="preserve">This setup anchors the notebook in a synthetic residual series used to examine</w:t>
       </w:r>
       <w:r>
         <w:t xml:space="preserve"> </w:t>
@@ -109,7 +213,7 @@
         <w:t xml:space="preserve">harutils()</w:t>
       </w:r>
       <w:r>
-        <w:t xml:space="preserve">. The semantic point is the one stated above: this notebook demonstrates Harbinger utility deviation measures for summarizing residual magnitudes (L1 and L2) and plotting results for quick inspection, so the raw signal needs to be visible before any fitting step hides that structure behind model output.</w:t>
+        <w:t xml:space="preserve">. The purpose is not to detect anomalies yet, but to understand how each deviation measure transforms the same underlying residuals before any filter criterion acts on them.</w:t>
       </w:r>
     </w:p>
     <w:p>
@@ -157,11 +261,73 @@
         </w:rPr>
         <w:t xml:space="preserve">(daltoolbox)</w:t>
       </w:r>
+    </w:p>
+    <w:p>
+      <w:pPr>
+        <w:pStyle w:val="SourceCode"/>
+      </w:pPr>
+      <w:r>
+        <w:rPr>
+          <w:rStyle w:val="VerbatimChar"/>
+        </w:rPr>
+        <w:t xml:space="preserve">## Warning: package 'daltoolbox' was built under R version 4.5.3</w:t>
+      </w:r>
+    </w:p>
+    <w:p>
+      <w:pPr>
+        <w:pStyle w:val="SourceCode"/>
+      </w:pPr>
+      <w:r>
+        <w:rPr>
+          <w:rStyle w:val="VerbatimChar"/>
+        </w:rPr>
+        <w:t xml:space="preserve">## </w:t>
+      </w:r>
       <w:r>
         <w:br/>
       </w:r>
       <w:r>
         <w:rPr>
+          <w:rStyle w:val="VerbatimChar"/>
+        </w:rPr>
+        <w:t xml:space="preserve">## Attaching package: 'daltoolbox'</w:t>
+      </w:r>
+    </w:p>
+    <w:p>
+      <w:pPr>
+        <w:pStyle w:val="SourceCode"/>
+      </w:pPr>
+      <w:r>
+        <w:rPr>
+          <w:rStyle w:val="VerbatimChar"/>
+        </w:rPr>
+        <w:t xml:space="preserve">## The following object is masked from 'package:base':</w:t>
+      </w:r>
+      <w:r>
+        <w:br/>
+      </w:r>
+      <w:r>
+        <w:rPr>
+          <w:rStyle w:val="VerbatimChar"/>
+        </w:rPr>
+        <w:t xml:space="preserve">## </w:t>
+      </w:r>
+      <w:r>
+        <w:br/>
+      </w:r>
+      <w:r>
+        <w:rPr>
+          <w:rStyle w:val="VerbatimChar"/>
+        </w:rPr>
+        <w:t xml:space="preserve">##     transform</w:t>
+      </w:r>
+    </w:p>
+    <w:p>
+      <w:pPr>
+        <w:pStyle w:val="SourceCode"/>
+      </w:pPr>
+      <w:r>
+        <w:rPr>
           <w:rStyle w:val="FunctionTok"/>
         </w:rPr>
         <w:t xml:space="preserve">library</w:t>
@@ -232,6 +398,33 @@
       </w:r>
       <w:r>
         <w:rPr>
+          <w:rStyle w:val="FunctionTok"/>
+        </w:rPr>
+        <w:t xml:space="preserve">set.seed</w:t>
+      </w:r>
+      <w:r>
+        <w:rPr>
+          <w:rStyle w:val="NormalTok"/>
+        </w:rPr>
+        <w:t xml:space="preserve">(</w:t>
+      </w:r>
+      <w:r>
+        <w:rPr>
+          <w:rStyle w:val="DecValTok"/>
+        </w:rPr>
+        <w:t xml:space="preserve">123</w:t>
+      </w:r>
+      <w:r>
+        <w:rPr>
+          <w:rStyle w:val="NormalTok"/>
+        </w:rPr>
+        <w:t xml:space="preserve">)</w:t>
+      </w:r>
+      <w:r>
+        <w:br/>
+      </w:r>
+      <w:r>
+        <w:rPr>
           <w:rStyle w:val="NormalTok"/>
         </w:rPr>
         <w:t xml:space="preserve">values </w:t>
@@ -322,7 +515,7 @@
       </w:r>
     </w:p>
     <w:bookmarkEnd w:id="11"/>
-    <w:bookmarkStart w:id="18" w:name="interpret-the-result-visually"/>
+    <w:bookmarkStart w:id="21" w:name="interpret-the-result-visually"/>
     <w:p>
       <w:pPr>
         <w:pStyle w:val="Heading3"/>
@@ -336,7 +529,7 @@
         <w:pStyle w:val="FirstParagraph"/>
       </w:pPr>
       <w:r>
-        <w:t xml:space="preserve">This first visual pass establishes what the method should react to in the raw series. Keep the method summary in mind here, because this notebook demonstrates Harbinger utility deviation measures for summarizing residual magnitudes (L1 and L2) and plotting results for quick inspection and the plot tells you whether that structure is clean, weak, local, repeated, or mixed with other effects.</w:t>
+        <w:t xml:space="preserve">The three plots below should be read comparatively. They all start from the same residual vector; only the deviation measure changes. The practical question is how strongly each measure inflates large residuals relative to moderate ones.</w:t>
       </w:r>
     </w:p>
     <w:p>
@@ -347,7 +540,34 @@
         <w:rPr>
           <w:rStyle w:val="CommentTok"/>
         </w:rPr>
-        <w:t xml:space="preserve"># L1 deviation measure over residual magnitude</w:t>
+        <w:t xml:space="preserve"># L1 deviation.</w:t>
+      </w:r>
+      <w:r>
+        <w:br/>
+      </w:r>
+      <w:r>
+        <w:rPr>
+          <w:rStyle w:val="CommentTok"/>
+        </w:rPr>
+        <w:t xml:space="preserve"># Objective: summarize residual magnitude in a simple and robust way.</w:t>
+      </w:r>
+      <w:r>
+        <w:br/>
+      </w:r>
+      <w:r>
+        <w:rPr>
+          <w:rStyle w:val="CommentTok"/>
+        </w:rPr>
+        <w:t xml:space="preserve"># Property: linear growth treats all increases proportionally, so it is less</w:t>
+      </w:r>
+      <w:r>
+        <w:br/>
+      </w:r>
+      <w:r>
+        <w:rPr>
+          <w:rStyle w:val="CommentTok"/>
+        </w:rPr>
+        <w:t xml:space="preserve"># dominated by a few very large residual peaks.</w:t>
       </w:r>
       <w:r>
         <w:br/>
@@ -430,7 +650,7 @@
               <a:graphicData uri="http://schemas.openxmlformats.org/drawingml/2006/picture">
                 <pic:pic>
                   <pic:nvPicPr>
-                    <pic:cNvPr descr="/home/gpca/harbinger/examples/general/doc/05-utilities-examples_deviation_measures_files/ea914c1128fb213627410d2c41d193859a720230.png" id="14" name="Picture"/>
+                    <pic:cNvPr descr="..\..\examples\general\doc\05-utilities-examples_deviation_measures_files/6a5d099b3d661cda6163fbcb415f3565c9422307.png" id="14" name="Picture"/>
                     <pic:cNvPicPr>
                       <a:picLocks noChangeArrowheads="1" noChangeAspect="1"/>
                     </pic:cNvPicPr>
@@ -471,7 +691,43 @@
         <w:rPr>
           <w:rStyle w:val="CommentTok"/>
         </w:rPr>
-        <w:t xml:space="preserve"># L2 deviation measure over residual magnitude</w:t>
+        <w:t xml:space="preserve"># L2 deviation.</w:t>
+      </w:r>
+      <w:r>
+        <w:br/>
+      </w:r>
+      <w:r>
+        <w:rPr>
+          <w:rStyle w:val="CommentTok"/>
+        </w:rPr>
+        <w:t xml:space="preserve"># Objective: emphasize large residuals more strongly than moderate ones.</w:t>
+      </w:r>
+      <w:r>
+        <w:br/>
+      </w:r>
+      <w:r>
+        <w:rPr>
+          <w:rStyle w:val="CommentTok"/>
+        </w:rPr>
+        <w:t xml:space="preserve"># Property: quadratic growth makes extreme values dominate the score more</w:t>
+      </w:r>
+      <w:r>
+        <w:br/>
+      </w:r>
+      <w:r>
+        <w:rPr>
+          <w:rStyle w:val="CommentTok"/>
+        </w:rPr>
+        <w:t xml:space="preserve"># aggressively, which can help isolate sharp peaks but also increases</w:t>
+      </w:r>
+      <w:r>
+        <w:br/>
+      </w:r>
+      <w:r>
+        <w:rPr>
+          <w:rStyle w:val="CommentTok"/>
+        </w:rPr>
+        <w:t xml:space="preserve"># sensitivity to large outliers.</w:t>
       </w:r>
       <w:r>
         <w:br/>
@@ -554,7 +810,7 @@
               <a:graphicData uri="http://schemas.openxmlformats.org/drawingml/2006/picture">
                 <pic:pic>
                   <pic:nvPicPr>
-                    <pic:cNvPr descr="/home/gpca/harbinger/examples/general/doc/05-utilities-examples_deviation_measures_files/5ed4ff7732d94f4245c394bfd9be6b6983927db1.png" id="17" name="Picture"/>
+                    <pic:cNvPr descr="..\..\examples\general\doc\05-utilities-examples_deviation_measures_files/09a36960d361c3ad697f252605187804bb9083c8.png" id="17" name="Picture"/>
                     <pic:cNvPicPr>
                       <a:picLocks noChangeArrowheads="1" noChangeAspect="1"/>
                     </pic:cNvPicPr>
@@ -587,9 +843,169 @@
         </w:drawing>
       </w:r>
     </w:p>
-    <w:bookmarkEnd w:id="18"/>
-    <w:bookmarkEnd w:id="19"/>
-    <w:bookmarkStart w:id="20" w:name="references"/>
+    <w:p>
+      <w:pPr>
+        <w:pStyle w:val="SourceCode"/>
+      </w:pPr>
+      <w:r>
+        <w:rPr>
+          <w:rStyle w:val="CommentTok"/>
+        </w:rPr>
+        <w:t xml:space="preserve"># Huber deviation.</w:t>
+      </w:r>
+      <w:r>
+        <w:br/>
+      </w:r>
+      <w:r>
+        <w:rPr>
+          <w:rStyle w:val="CommentTok"/>
+        </w:rPr>
+        <w:t xml:space="preserve"># Objective: preserve sensitivity to moderate residual growth while reducing</w:t>
+      </w:r>
+      <w:r>
+        <w:br/>
+      </w:r>
+      <w:r>
+        <w:rPr>
+          <w:rStyle w:val="CommentTok"/>
+        </w:rPr>
+        <w:t xml:space="preserve"># the dominance of very large peaks.</w:t>
+      </w:r>
+      <w:r>
+        <w:br/>
+      </w:r>
+      <w:r>
+        <w:rPr>
+          <w:rStyle w:val="CommentTok"/>
+        </w:rPr>
+        <w:t xml:space="preserve"># Property: Huber behaves quadratically near zero and linearly in the tails,</w:t>
+      </w:r>
+      <w:r>
+        <w:br/>
+      </w:r>
+      <w:r>
+        <w:rPr>
+          <w:rStyle w:val="CommentTok"/>
+        </w:rPr>
+        <w:t xml:space="preserve"># making it a compromise between L2 sensitivity and L1 robustness.</w:t>
+      </w:r>
+      <w:r>
+        <w:br/>
+      </w:r>
+      <w:r>
+        <w:rPr>
+          <w:rStyle w:val="NormalTok"/>
+        </w:rPr>
+        <w:t xml:space="preserve">vh </w:t>
+      </w:r>
+      <w:r>
+        <w:rPr>
+          <w:rStyle w:val="OtherTok"/>
+        </w:rPr>
+        <w:t xml:space="preserve">&lt;-</w:t>
+      </w:r>
+      <w:r>
+        <w:rPr>
+          <w:rStyle w:val="NormalTok"/>
+        </w:rPr>
+        <w:t xml:space="preserve"> hutils</w:t>
+      </w:r>
+      <w:r>
+        <w:rPr>
+          <w:rStyle w:val="SpecialCharTok"/>
+        </w:rPr>
+        <w:t xml:space="preserve">$</w:t>
+      </w:r>
+      <w:r>
+        <w:rPr>
+          <w:rStyle w:val="FunctionTok"/>
+        </w:rPr>
+        <w:t xml:space="preserve">har_deviation_huber</w:t>
+      </w:r>
+      <w:r>
+        <w:rPr>
+          <w:rStyle w:val="NormalTok"/>
+        </w:rPr>
+        <w:t xml:space="preserve">(values)</w:t>
+      </w:r>
+      <w:r>
+        <w:br/>
+      </w:r>
+      <w:r>
+        <w:rPr>
+          <w:rStyle w:val="FunctionTok"/>
+        </w:rPr>
+        <w:t xml:space="preserve">har_plot</w:t>
+      </w:r>
+      <w:r>
+        <w:rPr>
+          <w:rStyle w:val="NormalTok"/>
+        </w:rPr>
+        <w:t xml:space="preserve">(</w:t>
+      </w:r>
+      <w:r>
+        <w:rPr>
+          <w:rStyle w:val="FunctionTok"/>
+        </w:rPr>
+        <w:t xml:space="preserve">harbinger</w:t>
+      </w:r>
+      <w:r>
+        <w:rPr>
+          <w:rStyle w:val="NormalTok"/>
+        </w:rPr>
+        <w:t xml:space="preserve">(), vh)</w:t>
+      </w:r>
+    </w:p>
+    <w:p>
+      <w:pPr>
+        <w:pStyle w:val="FirstParagraph"/>
+      </w:pPr>
+      <w:r>
+        <w:drawing>
+          <wp:inline>
+            <wp:extent cx="4620126" cy="3696101"/>
+            <wp:effectExtent b="0" l="0" r="0" t="0"/>
+            <wp:docPr descr="" title="" id="19" name="Picture"/>
+            <a:graphic>
+              <a:graphicData uri="http://schemas.openxmlformats.org/drawingml/2006/picture">
+                <pic:pic>
+                  <pic:nvPicPr>
+                    <pic:cNvPr descr="..\..\examples\general\doc\05-utilities-examples_deviation_measures_files/9ac9f2156dc4f1c539905a77523c31d78a32990c.png" id="20" name="Picture"/>
+                    <pic:cNvPicPr>
+                      <a:picLocks noChangeArrowheads="1" noChangeAspect="1"/>
+                    </pic:cNvPicPr>
+                  </pic:nvPicPr>
+                  <pic:blipFill>
+                    <a:blip r:embed="rId18"/>
+                    <a:stretch>
+                      <a:fillRect/>
+                    </a:stretch>
+                  </pic:blipFill>
+                  <pic:spPr bwMode="auto">
+                    <a:xfrm>
+                      <a:off x="0" y="0"/>
+                      <a:ext cx="4620126" cy="3696101"/>
+                    </a:xfrm>
+                    <a:prstGeom prst="rect">
+                      <a:avLst/>
+                    </a:prstGeom>
+                    <a:noFill/>
+                    <a:ln w="9525">
+                      <a:noFill/>
+                      <a:headEnd/>
+                      <a:tailEnd/>
+                    </a:ln>
+                  </pic:spPr>
+                </pic:pic>
+              </a:graphicData>
+            </a:graphic>
+          </wp:inline>
+        </w:drawing>
+      </w:r>
+    </w:p>
+    <w:bookmarkEnd w:id="21"/>
+    <w:bookmarkEnd w:id="22"/>
+    <w:bookmarkStart w:id="23" w:name="references"/>
     <w:p>
       <w:pPr>
         <w:pStyle w:val="Heading2"/>
@@ -603,7 +1019,7 @@
         <w:pStyle w:val="Compact"/>
         <w:numPr>
           <w:ilvl w:val="0"/>
-          <w:numId w:val="1002"/>
+          <w:numId w:val="1003"/>
         </w:numPr>
       </w:pPr>
       <w:r>
@@ -615,14 +1031,26 @@
         <w:pStyle w:val="Compact"/>
         <w:numPr>
           <w:ilvl w:val="0"/>
-          <w:numId w:val="1002"/>
+          <w:numId w:val="1003"/>
         </w:numPr>
       </w:pPr>
       <w:r>
         <w:t xml:space="preserve">Shewhart, W. A. (1931). Economic Control of Quality of Manufactured Product. D. Van Nostrand. (three-sigma rule)</w:t>
       </w:r>
     </w:p>
-    <w:bookmarkEnd w:id="20"/>
+    <w:p>
+      <w:pPr>
+        <w:pStyle w:val="Compact"/>
+        <w:numPr>
+          <w:ilvl w:val="0"/>
+          <w:numId w:val="1003"/>
+        </w:numPr>
+      </w:pPr>
+      <w:r>
+        <w:t xml:space="preserve">Huber, P. J. (1964). Robust Estimation of a Location Parameter. Annals of Mathematical Statistics, 35(1), 73-101.</w:t>
+      </w:r>
+    </w:p>
+    <w:bookmarkEnd w:id="23"/>
     <w:sectPr>
       <w:footnotePr>
         <w:numRestart w:val="eachSect"/>
@@ -843,6 +1271,9 @@
     <w:abstractNumId w:val="991"/>
   </w:num>
   <w:num w:numId="1002">
+    <w:abstractNumId w:val="991"/>
+  </w:num>
+  <w:num w:numId="1003">
     <w:abstractNumId w:val="991"/>
   </w:num>
 </w:numbering>

</xml_diff>